<commit_message>
fix minor issues from homework exercises tong-hop-bai-lam
</commit_message>
<xml_diff>
--- a/bai-tap-nhom/buoi-1/bai-tap-ve-nha/tong-hop-bai-lam/25210152_25210242_25210146_25210179.docx
+++ b/bai-tap-nhom/buoi-1/bai-tap-ve-nha/tong-hop-bai-lam/25210152_25210242_25210146_25210179.docx
@@ -340,7 +340,7 @@
           <w:ilvl w:val="0"/>
           <w:numId w:val="1"/>
         </w:numPr>
-        <w:spacing w:line="360" w:lineRule="auto"/>
+        <w:spacing w:after="0" w:line="360" w:lineRule="auto"/>
         <w:ind w:left="360"/>
         <w:jc w:val="both"/>
         <w:rPr>
@@ -1536,7 +1536,7 @@
           <w:sz w:val="26"/>
           <w:szCs w:val="26"/>
         </w:rPr>
-        <w:t xml:space="preserve"> What potential issues do you foresee this process might have? What</w:t>
+        <w:t>What potential issues do you foresee this process might have? What</w:t>
       </w:r>
       <w:r>
         <w:rPr>
@@ -1556,17 +1556,7 @@
           <w:sz w:val="26"/>
           <w:szCs w:val="26"/>
         </w:rPr>
-        <w:t>information would you need to collect in order to analyze these issues</w:t>
-      </w:r>
-      <w:r>
-        <w:rPr>
-          <w:rFonts w:ascii="Times New Roman" w:hAnsi="Times New Roman" w:cs="Times New Roman"/>
-          <w:b/>
-          <w:bCs/>
-          <w:sz w:val="26"/>
-          <w:szCs w:val="26"/>
-        </w:rPr>
-        <w:t>?</w:t>
+        <w:t>information would you need to collect in order to analyze these issues?</w:t>
       </w:r>
     </w:p>
     <w:p>
@@ -1805,7 +1795,7 @@
           <w:sz w:val="26"/>
           <w:szCs w:val="26"/>
         </w:rPr>
-        <w:t>What possible changes do you think could be made to this process in order to address the above issues? Which performance measure would these changes improve</w:t>
+        <w:t xml:space="preserve">What possible changes do you think could be made to this process in order to </w:t>
       </w:r>
       <w:r>
         <w:rPr>
@@ -1815,7 +1805,17 @@
           <w:sz w:val="26"/>
           <w:szCs w:val="26"/>
         </w:rPr>
-        <w:t>?</w:t>
+        <w:t xml:space="preserve">     </w:t>
+      </w:r>
+      <w:r>
+        <w:rPr>
+          <w:rFonts w:ascii="Times New Roman" w:hAnsi="Times New Roman" w:cs="Times New Roman"/>
+          <w:b/>
+          <w:bCs/>
+          <w:sz w:val="26"/>
+          <w:szCs w:val="26"/>
+        </w:rPr>
+        <w:t>address the above issues? Which performance measure would these changes improve?</w:t>
       </w:r>
     </w:p>
     <w:tbl>
@@ -3686,6 +3686,7 @@
   <w:style w:type="character" w:default="1" w:styleId="DefaultParagraphFont">
     <w:name w:val="Default Paragraph Font"/>
     <w:uiPriority w:val="1"/>
+    <w:semiHidden/>
     <w:unhideWhenUsed/>
   </w:style>
   <w:style w:type="table" w:default="1" w:styleId="TableNormal">

</xml_diff>

<commit_message>
Fix minor issues homework exercises tong-hop-bai-lam
</commit_message>
<xml_diff>
--- a/bai-tap-nhom/buoi-1/bai-tap-ve-nha/tong-hop-bai-lam/25210152_25210242_25210146_25210179.docx
+++ b/bai-tap-nhom/buoi-1/bai-tap-ve-nha/tong-hop-bai-lam/25210152_25210242_25210146_25210179.docx
@@ -1104,7 +1104,13 @@
     </w:p>
     <w:p>
       <w:pPr>
+        <w:pStyle w:val="ListParagraph"/>
+        <w:numPr>
+          <w:ilvl w:val="0"/>
+          <w:numId w:val="1"/>
+        </w:numPr>
         <w:spacing w:after="0" w:line="360" w:lineRule="auto"/>
+        <w:ind w:left="360"/>
         <w:jc w:val="both"/>
         <w:rPr>
           <w:rFonts w:ascii="Times New Roman" w:hAnsi="Times New Roman" w:cs="Times New Roman"/>
@@ -1122,7 +1128,7 @@
           <w:sz w:val="26"/>
           <w:szCs w:val="26"/>
         </w:rPr>
-        <w:t>5. What are the possible outcomes of this process?</w:t>
+        <w:t>What are the possible outcomes of this process?</w:t>
       </w:r>
     </w:p>
     <w:p>
@@ -1767,7 +1773,23 @@
           <w:sz w:val="26"/>
           <w:szCs w:val="26"/>
         </w:rPr>
-        <w:t xml:space="preserve">Dữ liệu sai lệch hóa đơn: Tỷ lệ hóa đơn có giá hoặc thời gian sử dụng thực tế không khớp với PO ban đầu. </w:t>
+        <w:t>Dữ liệu sai lệch hóa đơn: Tỷ lệ hóa đơn có giá hoặc thời gian sử dụng thực tế không khớp với PO ban đầ</w:t>
+      </w:r>
+      <w:r>
+        <w:rPr>
+          <w:rFonts w:ascii="Times New Roman" w:hAnsi="Times New Roman" w:cs="Times New Roman"/>
+          <w:sz w:val="26"/>
+          <w:szCs w:val="26"/>
+        </w:rPr>
+        <w:t>u</w:t>
+      </w:r>
+      <w:r>
+        <w:rPr>
+          <w:rFonts w:ascii="Times New Roman" w:hAnsi="Times New Roman" w:cs="Times New Roman"/>
+          <w:sz w:val="26"/>
+          <w:szCs w:val="26"/>
+        </w:rPr>
+        <w:t xml:space="preserve">. </w:t>
       </w:r>
     </w:p>
     <w:p>

</xml_diff>